<commit_message>
Simplify resumes for external readers: drop internal codenames and trim projects.
Replace AMP/Martech/NOCIM/Load Healer detail with outcome language, and keep side projects to one line each.

Co-authored-by: Cursor <cursoragent@cursor.com>
</commit_message>
<xml_diff>
--- a/Mingresume-ai-infra.docx
+++ b/Mingresume-ai-infra.docx
@@ -77,37 +77,7 @@
           <w:i/>
           <w:sz w:val="20"/>
         </w:rPr>
-        <w:t xml:space="preserve"> [github.com/mailming](https://github.com/mailming) · </w:t>
-      </w:r>
-      <w:r>
-        <w:rPr>
-          <w:b/>
-          <w:i/>
-          <w:sz w:val="20"/>
-        </w:rPr>
-        <w:t>Jiadroid:</w:t>
-      </w:r>
-      <w:r>
-        <w:rPr>
-          <w:i/>
-          <w:sz w:val="20"/>
-        </w:rPr>
-        <w:t xml:space="preserve"> [github.com/mailming/jiadroid](https://github.com/mailming/jiadroid) · </w:t>
-      </w:r>
-      <w:r>
-        <w:rPr>
-          <w:b/>
-          <w:i/>
-          <w:sz w:val="20"/>
-        </w:rPr>
-        <w:t>SmartTuna:</w:t>
-      </w:r>
-      <w:r>
-        <w:rPr>
-          <w:i/>
-          <w:sz w:val="20"/>
-        </w:rPr>
-        <w:t xml:space="preserve"> [smarttuna.ai](https://smarttuna.ai)</w:t>
+        <w:t xml:space="preserve"> [github.com/mailming](https://github.com/mailming)</w:t>
       </w:r>
     </w:p>
     <w:p>
@@ -140,124 +110,72 @@
         <w:rPr>
           <w:sz w:val="21"/>
         </w:rPr>
-        <w:t xml:space="preserve">AI infrastructure / platform engineer building production agentic systems and the platforms that run them. At GEICO Developer Engineering (Staff-IC on Artifact Management), drove Artifactory to </w:t>
-      </w:r>
-      <w:r>
-        <w:rPr>
-          <w:b/>
-          <w:sz w:val="21"/>
-        </w:rPr>
-        <w:t>four-nines availability</w:t>
-      </w:r>
-      <w:r>
-        <w:rPr>
-          <w:sz w:val="21"/>
-        </w:rPr>
-        <w:t xml:space="preserve">, shipped </w:t>
-      </w:r>
-      <w:r>
-        <w:rPr>
-          <w:b/>
-          <w:sz w:val="21"/>
-        </w:rPr>
-        <w:t>Load Healer Reactive</w:t>
-      </w:r>
-      <w:r>
-        <w:rPr>
-          <w:sz w:val="21"/>
-        </w:rPr>
-        <w:t xml:space="preserve"> (OUTAGE → HTTP 429 throttle on NP/PD2), and am leading </w:t>
-      </w:r>
-      <w:r>
-        <w:rPr>
-          <w:b/>
-          <w:sz w:val="21"/>
-        </w:rPr>
-        <w:t>Martech → JFrog SaaS cutover</w:t>
-      </w:r>
-      <w:r>
-        <w:rPr>
-          <w:sz w:val="21"/>
-        </w:rPr>
-        <w:t xml:space="preserve"> outreach (Jan 30 hard date) across MAP, CDP, Billing, and Payments while running </w:t>
-      </w:r>
-      <w:r>
-        <w:rPr>
-          <w:rFonts w:ascii="Consolas" w:hAnsi="Consolas"/>
-          <w:sz w:val="21"/>
-        </w:rPr>
-        <w:t>amp-migrate</w:t>
-      </w:r>
-      <w:r>
-        <w:rPr>
-          <w:sz w:val="21"/>
-        </w:rPr>
-        <w:t xml:space="preserve"> for OIDC/repo-settings campaigns. Invited to GEICO's </w:t>
-      </w:r>
-      <w:r>
-        <w:rPr>
-          <w:b/>
-          <w:sz w:val="21"/>
-        </w:rPr>
-        <w:t>Claude Code pilot</w:t>
-      </w:r>
-      <w:r>
-        <w:rPr>
-          <w:sz w:val="21"/>
-        </w:rPr>
-        <w:t xml:space="preserve">; built the </w:t>
-      </w:r>
-      <w:r>
-        <w:rPr>
-          <w:b/>
-          <w:sz w:val="21"/>
-        </w:rPr>
-        <w:t>Cursor × Claude Code MCP bridge</w:t>
-      </w:r>
-      <w:r>
-        <w:rPr>
-          <w:sz w:val="21"/>
-        </w:rPr>
-        <w:t xml:space="preserve"> and landed MCP servers + agent skills in AMP production. Outside work: founded </w:t>
-      </w:r>
-      <w:r>
-        <w:rPr>
-          <w:b/>
-          <w:sz w:val="21"/>
-        </w:rPr>
-        <w:t>[Jiadroid](https://github.com/mailming/jiadroid)</w:t>
-      </w:r>
-      <w:r>
-        <w:rPr>
-          <w:sz w:val="21"/>
-        </w:rPr>
-        <w:t xml:space="preserve"> (phone-as-robot-brain protocol + ESP32 2WD + Follow Me apps) and led the </w:t>
-      </w:r>
-      <w:r>
-        <w:rPr>
-          <w:b/>
-          <w:sz w:val="21"/>
-        </w:rPr>
-        <w:t>OpenClaw cost-aware runtime</w:t>
-      </w:r>
-      <w:r>
-        <w:rPr>
-          <w:sz w:val="21"/>
-        </w:rPr>
-        <w:t xml:space="preserve"> (Purdue ECE 50874). Founder of </w:t>
-      </w:r>
-      <w:r>
-        <w:rPr>
-          <w:b/>
-          <w:sz w:val="21"/>
-        </w:rPr>
-        <w:t>[SmartTuna](https://smarttuna.ai)</w:t>
-      </w:r>
-      <w:r>
-        <w:rPr>
-          <w:sz w:val="21"/>
-        </w:rPr>
-        <w:t>. 20+ years HA platform (Navan SOC 2 / IPO; Turn/Amobee Jenkins+Nexus HA, $600K+/yr savings). MS AI @ Purdue (in progress). U.S. Citizen.</w:t>
+        <w:t xml:space="preserve">AI infrastructure and platform engineer who builds production agent systems and the reliability platforms underneath them. At GEICO, Staff-scope owner of the enterprise artifact registry: drove </w:t>
+      </w:r>
+      <w:r>
+        <w:rPr>
+          <w:b/>
+          <w:sz w:val="21"/>
+        </w:rPr>
+        <w:t>99.99% availability</w:t>
+      </w:r>
+      <w:r>
+        <w:rPr>
+          <w:sz w:val="21"/>
+        </w:rPr>
+        <w:t xml:space="preserve">, shipped overload protection that returns HTTP 429 under node saturation, and lead org-wide </w:t>
+      </w:r>
+      <w:r>
+        <w:rPr>
+          <w:b/>
+          <w:sz w:val="21"/>
+        </w:rPr>
+        <w:t>migration to JFrog SaaS</w:t>
+      </w:r>
+      <w:r>
+        <w:rPr>
+          <w:sz w:val="21"/>
+        </w:rPr>
+        <w:t xml:space="preserve">. Invited to the Claude Code pilot; integrated Cursor/Claude tooling and MCP into platform workflows. Side projects: </w:t>
+      </w:r>
+      <w:r>
+        <w:rPr>
+          <w:b/>
+          <w:sz w:val="21"/>
+        </w:rPr>
+        <w:t>Jiadroid</w:t>
+      </w:r>
+      <w:r>
+        <w:rPr>
+          <w:sz w:val="21"/>
+        </w:rPr>
+        <w:t xml:space="preserve"> (phone-as-robot-brain), </w:t>
+      </w:r>
+      <w:r>
+        <w:rPr>
+          <w:b/>
+          <w:sz w:val="21"/>
+        </w:rPr>
+        <w:t>OpenClaw</w:t>
+      </w:r>
+      <w:r>
+        <w:rPr>
+          <w:sz w:val="21"/>
+        </w:rPr>
+        <w:t xml:space="preserve"> cost-aware agent runtime (Purdue), </w:t>
+      </w:r>
+      <w:r>
+        <w:rPr>
+          <w:b/>
+          <w:sz w:val="21"/>
+        </w:rPr>
+        <w:t>SmartTuna</w:t>
+      </w:r>
+      <w:r>
+        <w:rPr>
+          <w:sz w:val="21"/>
+        </w:rPr>
+        <w:t>. 20+ years HA platform (Navan SOC 2/IPO; Turn/Amobee Jenkins+Nexus HA, $600K+/yr savings). MS AI @ Purdue. U.S. Citizen.</w:t>
       </w:r>
     </w:p>
     <w:p>
@@ -279,21 +197,27 @@
           <w:color w:val="1F3A68"/>
           <w:sz w:val="26"/>
         </w:rPr>
-        <w:t>SELECTED AI WORK</w:t>
+        <w:t>SELECTED PROJECTS</w:t>
       </w:r>
     </w:p>
     <w:p>
       <w:pPr>
-        <w:pStyle w:val="ResumeHeader"/>
-        <w:spacing w:before="160" w:after="0"/>
-      </w:pPr>
-      <w:r>
-        <w:rPr>
-          <w:b/>
-          <w:color w:val="1F3A68"/>
-          <w:sz w:val="23"/>
-        </w:rPr>
-        <w:t>Jiadroid — *Founder · [github.com/mailming/jiadroid](https://github.com/mailming/jiadroid)*</w:t>
+        <w:spacing w:after="40"/>
+      </w:pPr>
+      <w:r>
+        <w:rPr>
+          <w:b/>
+          <w:i/>
+          <w:sz w:val="20"/>
+        </w:rPr>
+        <w:t>Jiadroid</w:t>
+      </w:r>
+      <w:r>
+        <w:rPr>
+          <w:i/>
+          <w:sz w:val="20"/>
+        </w:rPr>
+        <w:t xml:space="preserve"> — [github.com/mailming/jiadroid](https://github.com/mailming/jiadroid) · Open phone-to-robot protocol, ESP32 firmware, and Follow Me apps so a phone can act as brain/eyes for robot bodies.</w:t>
       </w:r>
     </w:p>
     <w:p>
@@ -302,353 +226,38 @@
       </w:pPr>
       <w:r>
         <w:rPr>
+          <w:b/>
           <w:i/>
-          <w:sz w:val="21"/>
-        </w:rPr>
-        <w:t>Phone-as-robot-brain · embodied agent platform (2026)</w:t>
+          <w:sz w:val="20"/>
+        </w:rPr>
+        <w:t>OpenClaw cost-aware runtime</w:t>
+      </w:r>
+      <w:r>
+        <w:rPr>
+          <w:i/>
+          <w:sz w:val="20"/>
+        </w:rPr>
+        <w:t xml:space="preserve"> — Purdue ECE 50874 · Token/cost/step budgets and policy around browser agents without rewriting agent core.</w:t>
       </w:r>
     </w:p>
     <w:p>
       <w:pPr>
-        <w:pStyle w:val="ResumeBullets"/>
         <w:spacing w:after="40"/>
       </w:pPr>
       <w:r>
         <w:rPr>
-          <w:sz w:val="21"/>
-        </w:rPr>
-        <w:t xml:space="preserve">Open </w:t>
-      </w:r>
-      <w:r>
-        <w:rPr>
-          <w:b/>
-          <w:sz w:val="21"/>
-        </w:rPr>
-        <w:t>phone↔robot protocol</w:t>
-      </w:r>
-      <w:r>
-        <w:rPr>
-          <w:sz w:val="21"/>
-        </w:rPr>
-        <w:t xml:space="preserve"> (device discovery, </w:t>
-      </w:r>
-      <w:r>
-        <w:rPr>
-          <w:rFonts w:ascii="Consolas" w:hAnsi="Consolas"/>
-          <w:sz w:val="21"/>
-        </w:rPr>
-        <w:t>motion.velocity</w:t>
-      </w:r>
-      <w:r>
-        <w:rPr>
-          <w:sz w:val="21"/>
-        </w:rPr>
-        <w:t>, latched estop) so a phone supplies brain/eyes/ears/internet for any compatible body</w:t>
-      </w:r>
-    </w:p>
-    <w:p>
-      <w:pPr>
-        <w:pStyle w:val="ResumeBullets"/>
-        <w:spacing w:after="40"/>
-      </w:pPr>
-      <w:r>
-        <w:rPr>
-          <w:sz w:val="21"/>
-        </w:rPr>
-        <w:t xml:space="preserve">Shipped </w:t>
-      </w:r>
-      <w:r>
-        <w:rPr>
-          <w:b/>
-          <w:sz w:val="21"/>
-        </w:rPr>
-        <w:t>ESP32-S3 firmware</w:t>
-      </w:r>
-      <w:r>
-        <w:rPr>
-          <w:sz w:val="21"/>
-        </w:rPr>
-        <w:t xml:space="preserve"> for a 2WD chassis (L9110S + encoders); Wi-Fi + </w:t>
-      </w:r>
-      <w:r>
-        <w:rPr>
-          <w:b/>
-          <w:sz w:val="21"/>
-        </w:rPr>
-        <w:t>USB-C serial / OTA</w:t>
-      </w:r>
-      <w:r>
-        <w:rPr>
-          <w:sz w:val="21"/>
-        </w:rPr>
-        <w:t xml:space="preserve"> from Android; Save Wi-Fi to NVS</w:t>
-      </w:r>
-    </w:p>
-    <w:p>
-      <w:pPr>
-        <w:pStyle w:val="ResumeBullets"/>
-        <w:spacing w:after="40"/>
-      </w:pPr>
-      <w:r>
-        <w:rPr>
-          <w:b/>
-          <w:sz w:val="21"/>
-        </w:rPr>
-        <w:t>Follow Me</w:t>
-      </w:r>
-      <w:r>
-        <w:rPr>
-          <w:sz w:val="21"/>
-        </w:rPr>
-        <w:t xml:space="preserve"> on Android + iOS (person/marker tracking, voice wake, emotion-driven eyes) driving duck + </w:t>
-      </w:r>
-      <w:r>
-        <w:rPr>
-          <w:b/>
-          <w:sz w:val="21"/>
-        </w:rPr>
-        <w:t>rover</w:t>
-      </w:r>
-      <w:r>
-        <w:rPr>
-          <w:sz w:val="21"/>
-        </w:rPr>
-        <w:t xml:space="preserve"> sims (kinematic + MuJoCo)</w:t>
-      </w:r>
-    </w:p>
-    <w:p>
-      <w:pPr>
-        <w:pStyle w:val="ResumeHeader"/>
-        <w:spacing w:before="160" w:after="0"/>
-      </w:pPr>
-      <w:r>
-        <w:rPr>
-          <w:b/>
-          <w:color w:val="1F3A68"/>
-          <w:sz w:val="23"/>
-        </w:rPr>
-        <w:t>OpenClaw Cost-Aware Runtime Plugin — *Project lead &amp; primary implementer*</w:t>
-      </w:r>
-    </w:p>
-    <w:p>
-      <w:pPr>
-        <w:spacing w:after="40"/>
-      </w:pPr>
-      <w:r>
-        <w:rPr>
+          <w:b/>
           <w:i/>
-          <w:sz w:val="21"/>
-        </w:rPr>
-        <w:t>Purdue ECE 50874/59500 · [github.com/mailming/openclaw](https://github.com/mailming/openclaw/tree/feature/llm-insights-manual-pricing) (2026)</w:t>
-      </w:r>
-    </w:p>
-    <w:p>
-      <w:pPr>
-        <w:pStyle w:val="ResumeBullets"/>
-        <w:spacing w:after="40"/>
-      </w:pPr>
-      <w:r>
-        <w:rPr>
-          <w:sz w:val="21"/>
-        </w:rPr>
-        <w:t>Governance layer wrapping browser agents with per-task token/cost/step budgets and post-action policy — agent core untouched</w:t>
-      </w:r>
-    </w:p>
-    <w:p>
-      <w:pPr>
-        <w:pStyle w:val="ResumeBullets"/>
-        <w:spacing w:after="40"/>
-      </w:pPr>
-      <w:r>
-        <w:rPr>
-          <w:sz w:val="21"/>
-        </w:rPr>
-        <w:t xml:space="preserve">LLM Insights gateway: rolling cost/latency aggregates, manual pricing overrides; </w:t>
-      </w:r>
-      <w:r>
-        <w:rPr>
-          <w:b/>
-          <w:sz w:val="21"/>
-        </w:rPr>
-        <w:t>AgentOps</w:t>
-      </w:r>
-      <w:r>
-        <w:rPr>
-          <w:sz w:val="21"/>
-        </w:rPr>
-        <w:t xml:space="preserve"> + </w:t>
-      </w:r>
-      <w:r>
-        <w:rPr>
-          <w:b/>
-          <w:sz w:val="21"/>
-        </w:rPr>
-        <w:t>Langfuse</w:t>
-      </w:r>
-      <w:r>
-        <w:rPr>
-          <w:sz w:val="21"/>
-        </w:rPr>
-        <w:t xml:space="preserve"> telemetry</w:t>
-      </w:r>
-    </w:p>
-    <w:p>
-      <w:pPr>
-        <w:pStyle w:val="ResumeHeader"/>
-        <w:spacing w:before="160" w:after="0"/>
-      </w:pPr>
-      <w:r>
-        <w:rPr>
-          <w:b/>
-          <w:color w:val="1F3A68"/>
-          <w:sz w:val="23"/>
-        </w:rPr>
-        <w:t>Claude Code / Cursor / MCP at GEICO (2025–2026)</w:t>
-      </w:r>
-    </w:p>
-    <w:p>
-      <w:pPr>
-        <w:spacing w:after="40"/>
-      </w:pPr>
+          <w:sz w:val="20"/>
+        </w:rPr>
+        <w:t>SmartTuna</w:t>
+      </w:r>
       <w:r>
         <w:rPr>
           <w:i/>
-          <w:sz w:val="21"/>
-        </w:rPr>
-        <w:t>DE AI Showcase 2026 · 282-associate org</w:t>
-      </w:r>
-    </w:p>
-    <w:p>
-      <w:pPr>
-        <w:pStyle w:val="ResumeBullets"/>
-        <w:spacing w:after="40"/>
-      </w:pPr>
-      <w:r>
-        <w:rPr>
-          <w:sz w:val="21"/>
-        </w:rPr>
-        <w:t xml:space="preserve">Portfolio: Claude Agent SDK Slack triage; </w:t>
-      </w:r>
-      <w:r>
-        <w:rPr>
-          <w:b/>
-          <w:sz w:val="21"/>
-        </w:rPr>
-        <w:t>AI-powered CI/CD / `amp-migrate` cutover</w:t>
-      </w:r>
-      <w:r>
-        <w:rPr>
-          <w:sz w:val="21"/>
-        </w:rPr>
-        <w:t xml:space="preserve"> path; Claude Code AMP/JFrog plugin; AI-consumable artifact-auth ADR</w:t>
-      </w:r>
-    </w:p>
-    <w:p>
-      <w:pPr>
-        <w:pStyle w:val="ResumeBullets"/>
-        <w:spacing w:after="40"/>
-      </w:pPr>
-      <w:r>
-        <w:rPr>
-          <w:b/>
-          <w:sz w:val="21"/>
-        </w:rPr>
-        <w:t>Cursor × Claude Code MCP bridge</w:t>
-      </w:r>
-      <w:r>
-        <w:rPr>
-          <w:sz w:val="21"/>
-        </w:rPr>
-        <w:t xml:space="preserve"> — enterprise Slack MCP credential reuse for Claude Code pilot</w:t>
-      </w:r>
-    </w:p>
-    <w:p>
-      <w:pPr>
-        <w:pStyle w:val="ResumeBullets"/>
-        <w:spacing w:after="40"/>
-      </w:pPr>
-      <w:r>
-        <w:rPr>
-          <w:sz w:val="21"/>
-        </w:rPr>
-        <w:t>Production MCP servers (JFrog, Slack, ADO, GitHub, Club) + agent skills (</w:t>
-      </w:r>
-      <w:r>
-        <w:rPr>
-          <w:rFonts w:ascii="Consolas" w:hAnsi="Consolas"/>
-          <w:sz w:val="21"/>
-        </w:rPr>
-        <w:t>solve-case</w:t>
-      </w:r>
-      <w:r>
-        <w:rPr>
-          <w:sz w:val="21"/>
-        </w:rPr>
-        <w:t xml:space="preserve">, </w:t>
-      </w:r>
-      <w:r>
-        <w:rPr>
-          <w:rFonts w:ascii="Consolas" w:hAnsi="Consolas"/>
-          <w:sz w:val="21"/>
-        </w:rPr>
-        <w:t>close-case</w:t>
-      </w:r>
-      <w:r>
-        <w:rPr>
-          <w:sz w:val="21"/>
-        </w:rPr>
-        <w:t xml:space="preserve">, </w:t>
-      </w:r>
-      <w:r>
-        <w:rPr>
-          <w:rFonts w:ascii="Consolas" w:hAnsi="Consolas"/>
-          <w:sz w:val="21"/>
-        </w:rPr>
-        <w:t>build-kb</w:t>
-      </w:r>
-      <w:r>
-        <w:rPr>
-          <w:sz w:val="21"/>
-        </w:rPr>
-        <w:t xml:space="preserve">); Slack </w:t>
-      </w:r>
-      <w:r>
-        <w:rPr>
-          <w:b/>
-          <w:sz w:val="21"/>
-        </w:rPr>
-        <w:t>maintenance-announcement</w:t>
-      </w:r>
-      <w:r>
-        <w:rPr>
-          <w:sz w:val="21"/>
-        </w:rPr>
-        <w:t xml:space="preserve"> skill</w:t>
-      </w:r>
-    </w:p>
-    <w:p>
-      <w:pPr>
-        <w:pStyle w:val="ResumeHeader"/>
-        <w:spacing w:before="160" w:after="0"/>
-      </w:pPr>
-      <w:r>
-        <w:rPr>
-          <w:b/>
-          <w:color w:val="1F3A68"/>
-          <w:sz w:val="23"/>
-        </w:rPr>
-        <w:t>SmartTuna — *Founder · [smarttuna.ai](https://smarttuna.ai)*</w:t>
-      </w:r>
-    </w:p>
-    <w:p>
-      <w:pPr>
-        <w:spacing w:after="40"/>
-      </w:pPr>
-      <w:r>
-        <w:rPr>
-          <w:sz w:val="21"/>
-        </w:rPr>
-        <w:t>LangGraph multi-agent stock analysis · Python + Astro UI</w:t>
+          <w:sz w:val="20"/>
+        </w:rPr>
+        <w:t xml:space="preserve"> — [smarttuna.ai](https://smarttuna.ai) · LangGraph multi-agent stock analysis.</w:t>
       </w:r>
     </w:p>
     <w:p>
@@ -684,7 +293,7 @@
           <w:color w:val="1F3A68"/>
           <w:sz w:val="23"/>
         </w:rPr>
-        <w:t>Senior Engineer — GEICO, Artifact Management Platform (Developer Engineering)</w:t>
+        <w:t>Senior Engineer — GEICO, Artifact Management (Developer Engineering)</w:t>
       </w:r>
     </w:p>
     <w:p>
@@ -704,19 +313,32 @@
           <w:i/>
           <w:sz w:val="20"/>
         </w:rPr>
-        <w:t xml:space="preserve"> · Staff-IC tech lead for AMP cross-org initiatives (Identity, SRE, Network, DE)</w:t>
+        <w:t xml:space="preserve"> · Staff-IC tech lead for the enterprise package registry and related developer platforms</w:t>
       </w:r>
     </w:p>
     <w:p>
       <w:pPr>
+        <w:pStyle w:val="ResumeBullets"/>
         <w:spacing w:after="40"/>
       </w:pPr>
       <w:r>
         <w:rPr>
-          <w:i/>
-          <w:sz w:val="21"/>
-        </w:rPr>
-        <w:t>Platform reliability + SaaS cutover for ML/AI developer workflows at GEICO scale</w:t>
+          <w:sz w:val="21"/>
+        </w:rPr>
+        <w:t xml:space="preserve">Drove Artifactory from ~1 major incident/month to a </w:t>
+      </w:r>
+      <w:r>
+        <w:rPr>
+          <w:b/>
+          <w:sz w:val="21"/>
+        </w:rPr>
+        <w:t>99.99% availability SLO</w:t>
+      </w:r>
+      <w:r>
+        <w:rPr>
+          <w:sz w:val="21"/>
+        </w:rPr>
+        <w:t>; on-call lead and primary author of post-incident write-ups</w:t>
       </w:r>
     </w:p>
     <w:p>
@@ -726,42 +348,22 @@
       </w:pPr>
       <w:r>
         <w:rPr>
-          <w:b/>
-          <w:sz w:val="21"/>
-        </w:rPr>
-        <w:t>Artifactory reliability:</w:t>
-      </w:r>
-      <w:r>
-        <w:rPr>
-          <w:sz w:val="21"/>
-        </w:rPr>
-        <w:t xml:space="preserve"> ~1 major incident/month → </w:t>
-      </w:r>
-      <w:r>
-        <w:rPr>
-          <w:b/>
-          <w:sz w:val="21"/>
-        </w:rPr>
-        <w:t>99.99% SLO</w:t>
-      </w:r>
-      <w:r>
-        <w:rPr>
-          <w:sz w:val="21"/>
-        </w:rPr>
-        <w:t xml:space="preserve">; upgraded to </w:t>
-      </w:r>
-      <w:r>
-        <w:rPr>
-          <w:b/>
-          <w:sz w:val="21"/>
-        </w:rPr>
-        <w:t>7.161.15</w:t>
-      </w:r>
-      <w:r>
-        <w:rPr>
-          <w:sz w:val="21"/>
-        </w:rPr>
-        <w:t>; AMP on-call lead</w:t>
+          <w:sz w:val="21"/>
+        </w:rPr>
+        <w:t xml:space="preserve">Shipped </w:t>
+      </w:r>
+      <w:r>
+        <w:rPr>
+          <w:b/>
+          <w:sz w:val="21"/>
+        </w:rPr>
+        <w:t>concurrency overload protection</w:t>
+      </w:r>
+      <w:r>
+        <w:rPr>
+          <w:sz w:val="21"/>
+        </w:rPr>
+        <w:t xml:space="preserve"> so a saturated node throttles the noisy client with HTTP 429 instead of failing for everyone; validated in non-prod and rolled out to production</w:t>
       </w:r>
     </w:p>
     <w:p>
@@ -771,55 +373,22 @@
       </w:pPr>
       <w:r>
         <w:rPr>
-          <w:b/>
-          <w:sz w:val="21"/>
-        </w:rPr>
-        <w:t>Load Healer Reactive</w:t>
-      </w:r>
-      <w:r>
-        <w:rPr>
-          <w:sz w:val="21"/>
-        </w:rPr>
-        <w:t xml:space="preserve"> (</w:t>
-      </w:r>
-      <w:r>
-        <w:rPr>
-          <w:rFonts w:ascii="Consolas" w:hAnsi="Consolas"/>
-          <w:sz w:val="21"/>
-        </w:rPr>
-        <w:t>pkg-jfrog-charts</w:t>
-      </w:r>
-      <w:r>
-        <w:rPr>
-          <w:sz w:val="21"/>
-        </w:rPr>
-        <w:t xml:space="preserve"> PR #109/#111) — NP validated + </w:t>
-      </w:r>
-      <w:r>
-        <w:rPr>
-          <w:b/>
-          <w:sz w:val="21"/>
-        </w:rPr>
-        <w:t>PD2</w:t>
-      </w:r>
-      <w:r>
-        <w:rPr>
-          <w:sz w:val="21"/>
-        </w:rPr>
-        <w:t xml:space="preserve"> deployed; OUTAGE → per-account </w:t>
-      </w:r>
-      <w:r>
-        <w:rPr>
-          <w:b/>
-          <w:sz w:val="21"/>
-        </w:rPr>
-        <w:t>HTTP 429</w:t>
-      </w:r>
-      <w:r>
-        <w:rPr>
-          <w:sz w:val="21"/>
-        </w:rPr>
-        <w:t xml:space="preserve"> instead of node meltdown; data-driven concurrency threshold (~640)</w:t>
+          <w:sz w:val="21"/>
+        </w:rPr>
+        <w:t xml:space="preserve">Leading </w:t>
+      </w:r>
+      <w:r>
+        <w:rPr>
+          <w:b/>
+          <w:sz w:val="21"/>
+        </w:rPr>
+        <w:t>registry consolidation to JFrog SaaS</w:t>
+      </w:r>
+      <w:r>
+        <w:rPr>
+          <w:sz w:val="21"/>
+        </w:rPr>
+        <w:t xml:space="preserve"> — partner with consumer teams, run migration tooling (OIDC + repo provisioning), and previously led the SaaS POC (11 package types end-to-end; large-scale load test)</w:t>
       </w:r>
     </w:p>
     <w:p>
@@ -829,55 +398,22 @@
       </w:pPr>
       <w:r>
         <w:rPr>
-          <w:b/>
-          <w:sz w:val="21"/>
-        </w:rPr>
-        <w:t>Martech-off / JFrog SaaS cutover</w:t>
-      </w:r>
-      <w:r>
-        <w:rPr>
-          <w:sz w:val="21"/>
-        </w:rPr>
-        <w:t xml:space="preserve"> (hard date Jan 30) — stood up </w:t>
-      </w:r>
-      <w:r>
-        <w:rPr>
-          <w:rFonts w:ascii="Consolas" w:hAnsi="Consolas"/>
-          <w:sz w:val="21"/>
-        </w:rPr>
-        <w:t>#amp-martech-migration</w:t>
-      </w:r>
-      <w:r>
-        <w:rPr>
-          <w:sz w:val="21"/>
-        </w:rPr>
-        <w:t xml:space="preserve"> / </w:t>
-      </w:r>
-      <w:r>
-        <w:rPr>
-          <w:rFonts w:ascii="Consolas" w:hAnsi="Consolas"/>
-          <w:sz w:val="21"/>
-        </w:rPr>
-        <w:t>#amp-cdp-migration</w:t>
-      </w:r>
-      <w:r>
-        <w:rPr>
-          <w:sz w:val="21"/>
-        </w:rPr>
-        <w:t xml:space="preserve">; kicked off MAP, CDP Self Serve/Chameleon, Billing, Payments, Bolt·Athena; installed </w:t>
-      </w:r>
-      <w:r>
-        <w:rPr>
-          <w:b/>
-          <w:sz w:val="21"/>
-        </w:rPr>
-        <w:t>`amp-migrate`</w:t>
-      </w:r>
-      <w:r>
-        <w:rPr>
-          <w:sz w:val="21"/>
-        </w:rPr>
-        <w:t xml:space="preserve"> for OIDC + repo-settings campaigns</w:t>
+          <w:sz w:val="21"/>
+        </w:rPr>
+        <w:t xml:space="preserve">Built </w:t>
+      </w:r>
+      <w:r>
+        <w:rPr>
+          <w:b/>
+          <w:sz w:val="21"/>
+        </w:rPr>
+        <w:t>Entra ID auth</w:t>
+      </w:r>
+      <w:r>
+        <w:rPr>
+          <w:sz w:val="21"/>
+        </w:rPr>
+        <w:t xml:space="preserve"> for the registry control-plane service (Go + API gateway) and deployed it to production on Azure</w:t>
       </w:r>
     </w:p>
     <w:p>
@@ -887,55 +423,86 @@
       </w:pPr>
       <w:r>
         <w:rPr>
-          <w:b/>
-          <w:sz w:val="21"/>
-        </w:rPr>
-        <w:t>Technical lead, JFrog SaaS POC</w:t>
-      </w:r>
-      <w:r>
-        <w:rPr>
-          <w:sz w:val="21"/>
-        </w:rPr>
-        <w:t xml:space="preserve"> — GitHub Actions validating </w:t>
-      </w:r>
-      <w:r>
-        <w:rPr>
-          <w:b/>
-          <w:sz w:val="21"/>
-        </w:rPr>
-        <w:t>all 11 package types</w:t>
-      </w:r>
-      <w:r>
-        <w:rPr>
-          <w:sz w:val="21"/>
-        </w:rPr>
-        <w:t xml:space="preserve"> end-to-end; load test </w:t>
-      </w:r>
-      <w:r>
-        <w:rPr>
-          <w:b/>
-          <w:sz w:val="21"/>
-        </w:rPr>
-        <w:t>5,000 repos / 5,000 parallel artifacts</w:t>
+          <w:sz w:val="21"/>
+        </w:rPr>
+        <w:t xml:space="preserve">Productionized </w:t>
+      </w:r>
+      <w:r>
+        <w:rPr>
+          <w:b/>
+          <w:sz w:val="21"/>
+        </w:rPr>
+        <w:t>Claude Code / Cursor / MCP</w:t>
+      </w:r>
+      <w:r>
+        <w:rPr>
+          <w:sz w:val="21"/>
+        </w:rPr>
+        <w:t xml:space="preserve"> for support and ops (Slack triage, agent skills, credential bridge for the Claude Code pilot)</w:t>
       </w:r>
     </w:p>
     <w:p>
       <w:pPr>
+        <w:pStyle w:val="ResumeHeader"/>
+        <w:spacing w:before="160" w:after="0"/>
+      </w:pPr>
+      <w:r>
+        <w:rPr>
+          <w:b/>
+          <w:color w:val="1F3A68"/>
+          <w:sz w:val="23"/>
+        </w:rPr>
+        <w:t>Staff Release Engineer / DevOps — Navan</w:t>
+      </w:r>
+    </w:p>
+    <w:p>
+      <w:pPr>
+        <w:spacing w:after="40"/>
+      </w:pPr>
+      <w:r>
+        <w:rPr>
+          <w:b/>
+          <w:sz w:val="21"/>
+        </w:rPr>
+        <w:t>01/2022 – 04/2025</w:t>
+      </w:r>
+    </w:p>
+    <w:p>
+      <w:pPr>
         <w:pStyle w:val="ResumeBullets"/>
         <w:spacing w:after="40"/>
       </w:pPr>
       <w:r>
         <w:rPr>
-          <w:b/>
-          <w:sz w:val="21"/>
-        </w:rPr>
-        <w:t>Entra ID auth for `amp-control-plane`</w:t>
-      </w:r>
-      <w:r>
-        <w:rPr>
-          <w:sz w:val="21"/>
-        </w:rPr>
-        <w:t xml:space="preserve"> (Go JWT + APIM); ACS production deploy</w:t>
+          <w:sz w:val="21"/>
+        </w:rPr>
+        <w:t xml:space="preserve">Led </w:t>
+      </w:r>
+      <w:r>
+        <w:rPr>
+          <w:b/>
+          <w:sz w:val="21"/>
+        </w:rPr>
+        <w:t>SOC 2 Type II</w:t>
+      </w:r>
+      <w:r>
+        <w:rPr>
+          <w:sz w:val="21"/>
+        </w:rPr>
+        <w:t xml:space="preserve"> remediation and secrets/quality gates for </w:t>
+      </w:r>
+      <w:r>
+        <w:rPr>
+          <w:b/>
+          <w:sz w:val="21"/>
+        </w:rPr>
+        <w:t>IPO readiness</w:t>
+      </w:r>
+      <w:r>
+        <w:rPr>
+          <w:sz w:val="21"/>
+        </w:rPr>
+        <w:t xml:space="preserve"> (Vault, SonarCloud)</w:t>
       </w:r>
     </w:p>
     <w:p>
@@ -945,55 +512,9 @@
       </w:pPr>
       <w:r>
         <w:rPr>
-          <w:b/>
-          <w:sz w:val="21"/>
-        </w:rPr>
-        <w:t>CoE author:</w:t>
-      </w:r>
-      <w:r>
-        <w:rPr>
-          <w:sz w:val="21"/>
-        </w:rPr>
-        <w:t xml:space="preserve"> NOCIM-11695 (Entra-ID outage), NOCIM-12455 (npm EINTEGRITY), </w:t>
-      </w:r>
-      <w:r>
-        <w:rPr>
-          <w:b/>
-          <w:sz w:val="21"/>
-        </w:rPr>
-        <w:t>NOCIM-13154</w:t>
-      </w:r>
-      <w:r>
-        <w:rPr>
-          <w:sz w:val="21"/>
-        </w:rPr>
-        <w:t xml:space="preserve"> (MarTech PD upgrade), </w:t>
-      </w:r>
-      <w:r>
-        <w:rPr>
-          <w:b/>
-          <w:sz w:val="21"/>
-        </w:rPr>
-        <w:t>NOCIM-13213</w:t>
-      </w:r>
-      <w:r>
-        <w:rPr>
-          <w:sz w:val="21"/>
-        </w:rPr>
-        <w:t xml:space="preserve"> (router OOM); PD Phase 1 stability + TLS renewals with </w:t>
-      </w:r>
-      <w:r>
-        <w:rPr>
-          <w:b/>
-          <w:sz w:val="21"/>
-        </w:rPr>
-        <w:t>&amp;lt;1 min</w:t>
-      </w:r>
-      <w:r>
-        <w:rPr>
-          <w:sz w:val="21"/>
-        </w:rPr>
-        <w:t xml:space="preserve"> outage</w:t>
+          <w:sz w:val="21"/>
+        </w:rPr>
+        <w:t>Owned release engineering and AWS CD; Bitrise mobile CI/CD</w:t>
       </w:r>
     </w:p>
     <w:p>
@@ -1007,7 +528,7 @@
           <w:color w:val="1F3A68"/>
           <w:sz w:val="23"/>
         </w:rPr>
-        <w:t>Staff Release Engineer / DevOps — Navan (formerly TripActions)</w:t>
+        <w:t>Lead Release Engineer — Turn / Amobee</w:t>
       </w:r>
     </w:p>
     <w:p>
@@ -1019,7 +540,7 @@
           <w:b/>
           <w:sz w:val="21"/>
         </w:rPr>
-        <w:t>01/2022 – 04/2025</w:t>
+        <w:t>12/2015 – 11/2021</w:t>
       </w:r>
     </w:p>
     <w:p>
@@ -1031,27 +552,7 @@
         <w:rPr>
           <w:sz w:val="21"/>
         </w:rPr>
-        <w:t xml:space="preserve">Led </w:t>
-      </w:r>
-      <w:r>
-        <w:rPr>
-          <w:b/>
-          <w:sz w:val="21"/>
-        </w:rPr>
-        <w:t>SOC 2 Type II</w:t>
-      </w:r>
-      <w:r>
-        <w:rPr>
-          <w:sz w:val="21"/>
-        </w:rPr>
-        <w:t xml:space="preserve"> audit remediation; Vault + SonarCloud for </w:t>
-      </w:r>
-      <w:r>
-        <w:rPr>
-          <w:b/>
-          <w:sz w:val="21"/>
-        </w:rPr>
-        <w:t>IPO readiness</w:t>
+        <w:t>Led release ops for a ~500-engineer org on thousands of servers worldwide</w:t>
       </w:r>
     </w:p>
     <w:p>
@@ -1061,9 +562,42 @@
       </w:pPr>
       <w:r>
         <w:rPr>
-          <w:sz w:val="21"/>
-        </w:rPr>
-        <w:t>Owned SCM/release engineering and AWS continuous delivery; Bitrise mobile CI/CD</w:t>
+          <w:b/>
+          <w:sz w:val="21"/>
+        </w:rPr>
+        <w:t>Jenkins HA</w:t>
+      </w:r>
+      <w:r>
+        <w:rPr>
+          <w:sz w:val="21"/>
+        </w:rPr>
+        <w:t xml:space="preserve"> and </w:t>
+      </w:r>
+      <w:r>
+        <w:rPr>
+          <w:b/>
+          <w:sz w:val="21"/>
+        </w:rPr>
+        <w:t>Nexus HA</w:t>
+      </w:r>
+      <w:r>
+        <w:rPr>
+          <w:sz w:val="21"/>
+        </w:rPr>
+        <w:t xml:space="preserve"> migrations — eliminated unplanned outages; </w:t>
+      </w:r>
+      <w:r>
+        <w:rPr>
+          <w:b/>
+          <w:sz w:val="21"/>
+        </w:rPr>
+        <w:t>$600K+/yr</w:t>
+      </w:r>
+      <w:r>
+        <w:rPr>
+          <w:sz w:val="21"/>
+        </w:rPr>
+        <w:t xml:space="preserve"> vs enterprise licensing</w:t>
       </w:r>
     </w:p>
     <w:p>
@@ -1077,7 +611,7 @@
           <w:color w:val="1F3A68"/>
           <w:sz w:val="23"/>
         </w:rPr>
-        <w:t>Lead Release Engineer — Turn / Amobee</w:t>
+        <w:t>Earlier roles</w:t>
       </w:r>
     </w:p>
     <w:p>
@@ -1087,232 +621,77 @@
       <w:r>
         <w:rPr>
           <w:b/>
-          <w:sz w:val="21"/>
-        </w:rPr>
-        <w:t>12/2015 – 11/2021</w:t>
-      </w:r>
-    </w:p>
-    <w:p>
-      <w:pPr>
-        <w:pStyle w:val="ResumeBullets"/>
-        <w:spacing w:after="40"/>
-      </w:pPr>
-      <w:r>
-        <w:rPr>
-          <w:sz w:val="21"/>
-        </w:rPr>
-        <w:t>Led 2 REs + 5 offshore NOC for ~500-engineer org, thousands of servers worldwide</w:t>
-      </w:r>
-    </w:p>
-    <w:p>
-      <w:pPr>
-        <w:pStyle w:val="ResumeBullets"/>
-        <w:spacing w:after="40"/>
-      </w:pPr>
-      <w:r>
-        <w:rPr>
-          <w:b/>
-          <w:sz w:val="21"/>
-        </w:rPr>
-        <w:t>Jenkins HA</w:t>
-      </w:r>
-      <w:r>
-        <w:rPr>
-          <w:sz w:val="21"/>
-        </w:rPr>
-        <w:t xml:space="preserve"> + </w:t>
-      </w:r>
-      <w:r>
-        <w:rPr>
-          <w:b/>
-          <w:sz w:val="21"/>
-        </w:rPr>
-        <w:t>Nexus HA</w:t>
-      </w:r>
-      <w:r>
-        <w:rPr>
-          <w:sz w:val="21"/>
-        </w:rPr>
-        <w:t xml:space="preserve"> — eliminated unplanned outages; </w:t>
-      </w:r>
-      <w:r>
-        <w:rPr>
-          <w:b/>
-          <w:sz w:val="21"/>
-        </w:rPr>
-        <w:t>$600K+/yr</w:t>
-      </w:r>
-      <w:r>
-        <w:rPr>
-          <w:sz w:val="21"/>
-        </w:rPr>
-        <w:t xml:space="preserve"> license savings vs enterprise</w:t>
-      </w:r>
-    </w:p>
-    <w:p>
-      <w:pPr>
-        <w:pStyle w:val="ResumeHeader"/>
-        <w:spacing w:before="160" w:after="0"/>
-      </w:pPr>
-      <w:r>
-        <w:rPr>
-          <w:b/>
-          <w:color w:val="1F3A68"/>
-          <w:sz w:val="23"/>
-        </w:rPr>
-        <w:t>Sr. Software Engineer — Skytree *(Machine Learning startup)*</w:t>
-      </w:r>
-    </w:p>
-    <w:p>
-      <w:pPr>
-        <w:spacing w:after="40"/>
-      </w:pPr>
-      <w:r>
-        <w:rPr>
-          <w:b/>
-          <w:sz w:val="21"/>
-        </w:rPr>
-        <w:t>04/2014 – 11/2015</w:t>
-      </w:r>
-    </w:p>
-    <w:p>
-      <w:pPr>
-        <w:pStyle w:val="ResumeBullets"/>
-        <w:spacing w:after="40"/>
-      </w:pPr>
-      <w:r>
-        <w:rPr>
-          <w:sz w:val="21"/>
-        </w:rPr>
-        <w:t>CI/CD for ML product; AWS EC2/S3/EMR dynamic clusters; PaaS for on-demand environments</w:t>
-      </w:r>
-    </w:p>
-    <w:p>
-      <w:pPr>
-        <w:pStyle w:val="ResumeHeader"/>
-        <w:spacing w:before="160" w:after="0"/>
-      </w:pPr>
-      <w:r>
-        <w:rPr>
-          <w:b/>
-          <w:color w:val="1F3A68"/>
-          <w:sz w:val="23"/>
-        </w:rPr>
-        <w:t>Sr. Software Engineer — Walmart Labs</w:t>
-      </w:r>
-    </w:p>
-    <w:p>
-      <w:pPr>
-        <w:spacing w:after="40"/>
-      </w:pPr>
-      <w:r>
-        <w:rPr>
-          <w:b/>
-          <w:sz w:val="21"/>
-        </w:rPr>
-        <w:t>03/2013 – 04/2014</w:t>
-      </w:r>
-      <w:r>
-        <w:rPr>
-          <w:sz w:val="21"/>
-        </w:rPr>
-        <w:t xml:space="preserve"> — Build/release automation Dev→Prod</w:t>
-      </w:r>
-    </w:p>
-    <w:p>
-      <w:pPr>
-        <w:pStyle w:val="ResumeHeader"/>
-        <w:spacing w:before="160" w:after="0"/>
-      </w:pPr>
-      <w:r>
-        <w:rPr>
-          <w:b/>
-          <w:color w:val="1F3A68"/>
-          <w:sz w:val="23"/>
-        </w:rPr>
-        <w:t>Software Engineer — Macrovision / Rovi</w:t>
-      </w:r>
-    </w:p>
-    <w:p>
-      <w:pPr>
-        <w:spacing w:after="40"/>
-      </w:pPr>
-      <w:r>
-        <w:rPr>
-          <w:b/>
-          <w:sz w:val="21"/>
-        </w:rPr>
-        <w:t>11/2009 – 02/2013</w:t>
-      </w:r>
-      <w:r>
-        <w:rPr>
-          <w:sz w:val="21"/>
-        </w:rPr>
-        <w:t xml:space="preserve"> — CM across 20+ projects; Hadoop/MapReduce/MongoDB; company-wide Git</w:t>
-      </w:r>
-    </w:p>
-    <w:p>
-      <w:pPr>
-        <w:pStyle w:val="ResumeHeader"/>
-        <w:spacing w:before="160" w:after="0"/>
-      </w:pPr>
-      <w:r>
-        <w:rPr>
-          <w:b/>
-          <w:color w:val="1F3A68"/>
-          <w:sz w:val="23"/>
-        </w:rPr>
-        <w:t>SCM Manager — Helio / Virgin Mobile USA / Sprint</w:t>
-      </w:r>
-    </w:p>
-    <w:p>
-      <w:pPr>
-        <w:spacing w:after="40"/>
-      </w:pPr>
-      <w:r>
-        <w:rPr>
-          <w:b/>
-          <w:sz w:val="21"/>
-        </w:rPr>
-        <w:t>02/2007 – 10/2009</w:t>
-      </w:r>
-      <w:r>
-        <w:rPr>
-          <w:sz w:val="21"/>
-        </w:rPr>
-        <w:t xml:space="preserve"> — CI/CD (CruiseControl, Hudson/Jenkins); VM + JBoss automation</w:t>
-      </w:r>
-    </w:p>
-    <w:p>
-      <w:pPr>
-        <w:pStyle w:val="ResumeHeader"/>
-        <w:spacing w:before="160" w:after="0"/>
-      </w:pPr>
-      <w:r>
-        <w:rPr>
-          <w:b/>
-          <w:color w:val="1F3A68"/>
-          <w:sz w:val="23"/>
-        </w:rPr>
-        <w:t>Software Developer — XLDynamics</w:t>
-      </w:r>
-    </w:p>
-    <w:p>
-      <w:pPr>
-        <w:spacing w:after="40"/>
-      </w:pPr>
-      <w:r>
-        <w:rPr>
-          <w:b/>
-          <w:sz w:val="21"/>
-        </w:rPr>
-        <w:t>01/2005 – 02/2007</w:t>
-      </w:r>
-      <w:r>
-        <w:rPr>
-          <w:sz w:val="21"/>
-        </w:rPr>
-        <w:t xml:space="preserve"> — Build/release automation; C++ XML/SOAP; Shell tooling</w:t>
+          <w:i/>
+          <w:sz w:val="20"/>
+        </w:rPr>
+        <w:t>Skytree</w:t>
+      </w:r>
+      <w:r>
+        <w:rPr>
+          <w:i/>
+          <w:sz w:val="20"/>
+        </w:rPr>
+        <w:t xml:space="preserve"> (ML startup) · </w:t>
+      </w:r>
+      <w:r>
+        <w:rPr>
+          <w:b/>
+          <w:i/>
+          <w:sz w:val="20"/>
+        </w:rPr>
+        <w:t>Walmart Labs</w:t>
+      </w:r>
+      <w:r>
+        <w:rPr>
+          <w:i/>
+          <w:sz w:val="20"/>
+        </w:rPr>
+        <w:t xml:space="preserve"> · </w:t>
+      </w:r>
+      <w:r>
+        <w:rPr>
+          <w:b/>
+          <w:i/>
+          <w:sz w:val="20"/>
+        </w:rPr>
+        <w:t>Macrovision/Rovi</w:t>
+      </w:r>
+      <w:r>
+        <w:rPr>
+          <w:i/>
+          <w:sz w:val="20"/>
+        </w:rPr>
+        <w:t xml:space="preserve"> · </w:t>
+      </w:r>
+      <w:r>
+        <w:rPr>
+          <w:b/>
+          <w:i/>
+          <w:sz w:val="20"/>
+        </w:rPr>
+        <w:t>Helio/Virgin/Sprint</w:t>
+      </w:r>
+      <w:r>
+        <w:rPr>
+          <w:i/>
+          <w:sz w:val="20"/>
+        </w:rPr>
+        <w:t xml:space="preserve"> · </w:t>
+      </w:r>
+      <w:r>
+        <w:rPr>
+          <w:b/>
+          <w:i/>
+          <w:sz w:val="20"/>
+        </w:rPr>
+        <w:t>XLDynamics</w:t>
+      </w:r>
+      <w:r>
+        <w:rPr>
+          <w:i/>
+          <w:sz w:val="20"/>
+        </w:rPr>
+        <w:t xml:space="preserve"> — CI/CD, build/release, and platform engineering (2005–2015)</w:t>
       </w:r>
     </w:p>
     <w:p>
@@ -1396,7 +775,7 @@
                 <w:b/>
                 <w:sz w:val="20"/>
               </w:rPr>
-              <w:t>AI / Agents / LLM</w:t>
+              <w:t>AI / Agents</w:t>
             </w:r>
           </w:p>
         </w:tc>
@@ -1409,7 +788,7 @@
               <w:rPr>
                 <w:sz w:val="20"/>
               </w:rPr>
-              <w:t>Claude Agent SDK, Claude Code &amp; plugins, Cursor agents &amp; MCP, MCP servers (JFrog, Slack, ADO, GitHub, Club), LangGraph, AgentOps, Langfuse, OpenClaw, Playwright agents, Claude / GPT / Gemini, Ollama, vLLM</w:t>
+              <w:t>Claude Agent SDK, Claude Code, Cursor, MCP, LangGraph, agent evals &amp; cost governance</w:t>
             </w:r>
           </w:p>
         </w:tc>
@@ -1425,7 +804,7 @@
                 <w:b/>
                 <w:sz w:val="20"/>
               </w:rPr>
-              <w:t>Embodied / Physical AI</w:t>
+              <w:t>Physical AI</w:t>
             </w:r>
           </w:p>
         </w:tc>
@@ -1438,7 +817,7 @@
               <w:rPr>
                 <w:sz w:val="20"/>
               </w:rPr>
-              <w:t>Jiadroid protocol, ESP32-S3 firmware, USB-C serial/OTA, Follow Me vision, multi-body sims (rover, MuJoCo duck)</w:t>
+              <w:t>Phone–robot protocols, ESP32, computer-vision Follow Me, multi-body simulation</w:t>
             </w:r>
           </w:p>
         </w:tc>
@@ -1454,7 +833,7 @@
                 <w:b/>
                 <w:sz w:val="20"/>
               </w:rPr>
-              <w:t>AI Infra concepts</w:t>
+              <w:t>Platform</w:t>
             </w:r>
           </w:p>
         </w:tc>
@@ -1467,65 +846,7 @@
               <w:rPr>
                 <w:sz w:val="20"/>
               </w:rPr>
-              <w:t>LLM cost governance, agent runtimes, evals &amp; traces, multi-model routing, MCP packaging</w:t>
-            </w:r>
-          </w:p>
-        </w:tc>
-      </w:tr>
-      <w:tr>
-        <w:tc>
-          <w:tcPr>
-            <w:tcW w:type="dxa" w:w="2448"/>
-          </w:tcPr>
-          <w:p>
-            <w:r>
-              <w:rPr>
-                <w:b/>
-                <w:sz w:val="20"/>
-              </w:rPr>
-              <w:t>Cloud &amp; Platform</w:t>
-            </w:r>
-          </w:p>
-        </w:tc>
-        <w:tc>
-          <w:tcPr>
-            <w:tcW w:type="dxa" w:w="7632"/>
-          </w:tcPr>
-          <w:p>
-            <w:r>
-              <w:rPr>
-                <w:sz w:val="20"/>
-              </w:rPr>
-              <w:t>AWS, Azure (AKS, ACR, Entra ID, Azure Firewall), Kubernetes, Helm, Terraform, Docker</w:t>
-            </w:r>
-          </w:p>
-        </w:tc>
-      </w:tr>
-      <w:tr>
-        <w:tc>
-          <w:tcPr>
-            <w:tcW w:type="dxa" w:w="2448"/>
-          </w:tcPr>
-          <w:p>
-            <w:r>
-              <w:rPr>
-                <w:b/>
-                <w:sz w:val="20"/>
-              </w:rPr>
-              <w:t>CI/CD &amp; Artifacts</w:t>
-            </w:r>
-          </w:p>
-        </w:tc>
-        <w:tc>
-          <w:tcPr>
-            <w:tcW w:type="dxa" w:w="7632"/>
-          </w:tcPr>
-          <w:p>
-            <w:r>
-              <w:rPr>
-                <w:sz w:val="20"/>
-              </w:rPr>
-              <w:t>Jenkins, GitHub Actions, Azure DevOps, ArgoCD, JFrog Artifactory / X-Ray / SaaS, Nexus, ACR</w:t>
+              <w:t>Kubernetes, Helm, Terraform, AWS, Azure, GitHub Actions, Azure DevOps, JFrog Artifactory</w:t>
             </w:r>
           </w:p>
         </w:tc>
@@ -1554,7 +875,7 @@
               <w:rPr>
                 <w:sz w:val="20"/>
               </w:rPr>
-              <w:t>Python, Go, Java, TypeScript, Shell, Kotlin/Swift (mobile clients), C/C++</w:t>
+              <w:t>Python, Go, TypeScript, Java, Shell</w:t>
             </w:r>
           </w:p>
         </w:tc>
@@ -1570,7 +891,7 @@
                 <w:b/>
                 <w:sz w:val="20"/>
               </w:rPr>
-              <w:t>Security &amp; Compliance</w:t>
+              <w:t>Security</w:t>
             </w:r>
           </w:p>
         </w:tc>
@@ -1583,36 +904,7 @@
               <w:rPr>
                 <w:sz w:val="20"/>
               </w:rPr>
-              <w:t>SOC 2 Type II, Vault, Azure Key Vault, OIDC, Entra ID</w:t>
-            </w:r>
-          </w:p>
-        </w:tc>
-      </w:tr>
-      <w:tr>
-        <w:tc>
-          <w:tcPr>
-            <w:tcW w:type="dxa" w:w="2448"/>
-          </w:tcPr>
-          <w:p>
-            <w:r>
-              <w:rPr>
-                <w:b/>
-                <w:sz w:val="20"/>
-              </w:rPr>
-              <w:t>Leadership</w:t>
-            </w:r>
-          </w:p>
-        </w:tc>
-        <w:tc>
-          <w:tcPr>
-            <w:tcW w:type="dxa" w:w="7632"/>
-          </w:tcPr>
-          <w:p>
-            <w:r>
-              <w:rPr>
-                <w:sz w:val="20"/>
-              </w:rPr>
-              <w:t>Staff-IC tech lead, cross-org cutover programs, on-call/incident ownership, AI-tooling advocacy</w:t>
+              <w:t>SOC 2, Vault, OIDC, Entra ID</w:t>
             </w:r>
           </w:p>
         </w:tc>
@@ -1664,12 +956,6 @@
         </w:rPr>
         <w:t>(In Progress)</w:t>
       </w:r>
-      <w:r>
-        <w:rPr>
-          <w:sz w:val="21"/>
-        </w:rPr>
-        <w:t xml:space="preserve"> — ECE 50874/59500 OpenClaw final project; CNIT 57500 Data Analysis (Fall 2026)</w:t>
-      </w:r>
     </w:p>
     <w:p>
       <w:pPr>
@@ -1695,14 +981,6 @@
         </w:rPr>
         <w:t>(Minors: Mathematics &amp; Economics)</w:t>
       </w:r>
-    </w:p>
-    <w:p>
-      <w:pPr>
-        <w:spacing w:before="40" w:after="40"/>
-        <w:pBdr>
-          <w:bottom w:val="single" w:sz="6" w:space="1" w:color="auto"/>
-        </w:pBdr>
-      </w:pPr>
     </w:p>
     <w:p>
       <w:pPr>

</xml_diff>